<commit_message>
Update FOC10, reference divorce template
</commit_message>
<xml_diff>
--- a/docassemble/MLHMotionRegardingChildSupport/data/templates/FOC_10_Addendum.docx
+++ b/docassemble/MLHMotionRegardingChildSupport/data/templates/FOC_10_Addendum.docx
@@ -8,22 +8,34 @@
           <w:tab w:val="left" w:leader="dot" w:pos="7200"/>
         </w:tabs>
         <w:rPr>
-          <w:rFonts w:ascii="Times New Roman" w:hAnsi="Times New Roman" w:cs="Times New Roman"/>
+          <w:rFonts w:ascii="Arial" w:hAnsi="Arial" w:cs="Arial"/>
           <w:b/>
           <w:bCs/>
-          <w:sz w:val="24"/>
-          <w:szCs w:val="24"/>
         </w:rPr>
       </w:pPr>
       <w:r>
         <w:rPr>
-          <w:rFonts w:ascii="Times New Roman" w:hAnsi="Times New Roman" w:cs="Times New Roman"/>
+          <w:rFonts w:ascii="Arial" w:hAnsi="Arial" w:cs="Arial"/>
           <w:b/>
           <w:bCs/>
-          <w:sz w:val="24"/>
-          <w:szCs w:val="24"/>
         </w:rPr>
         <w:t>Children’s Names, continued</w:t>
+      </w:r>
+      <w:r>
+        <w:rPr>
+          <w:rFonts w:ascii="Arial" w:hAnsi="Arial" w:cs="Arial"/>
+          <w:b/>
+          <w:bCs/>
+        </w:rPr>
+        <w:t xml:space="preserve"> from 2</w:t>
+      </w:r>
+      <w:r>
+        <w:rPr>
+          <w:rFonts w:ascii="Arial" w:hAnsi="Arial" w:cs="Arial"/>
+          <w:b/>
+          <w:bCs/>
+        </w:rPr>
+        <w:t>a:</w:t>
       </w:r>
     </w:p>
     <w:p>
@@ -32,33 +44,25 @@
           <w:tab w:val="left" w:leader="dot" w:pos="7200"/>
         </w:tabs>
         <w:rPr>
-          <w:rFonts w:ascii="Times New Roman" w:hAnsi="Times New Roman" w:cs="Times New Roman"/>
-          <w:sz w:val="24"/>
-          <w:szCs w:val="24"/>
+          <w:rFonts w:ascii="Arial" w:hAnsi="Arial" w:cs="Arial"/>
         </w:rPr>
       </w:pPr>
       <w:r>
         <w:rPr>
-          <w:rFonts w:ascii="Times New Roman" w:hAnsi="Times New Roman" w:cs="Times New Roman"/>
-          <w:sz w:val="24"/>
-          <w:szCs w:val="24"/>
+          <w:rFonts w:ascii="Arial" w:hAnsi="Arial" w:cs="Arial"/>
         </w:rPr>
         <w:t>{%</w:t>
       </w:r>
       <w:r>
         <w:rPr>
-          <w:rFonts w:ascii="Times New Roman" w:hAnsi="Times New Roman" w:cs="Times New Roman"/>
-          <w:sz w:val="24"/>
-          <w:szCs w:val="24"/>
+          <w:rFonts w:ascii="Arial" w:hAnsi="Arial" w:cs="Arial"/>
           <w:highlight w:val="cyan"/>
         </w:rPr>
         <w:t xml:space="preserve">p for </w:t>
       </w:r>
       <w:r>
         <w:rPr>
-          <w:rFonts w:ascii="Times New Roman" w:hAnsi="Times New Roman" w:cs="Times New Roman"/>
-          <w:sz w:val="24"/>
-          <w:szCs w:val="24"/>
+          <w:rFonts w:ascii="Arial" w:hAnsi="Arial" w:cs="Arial"/>
           <w:highlight w:val="cyan"/>
         </w:rPr>
         <w:t xml:space="preserve">child in </w:t>
@@ -66,18 +70,14 @@
       <w:proofErr w:type="gramStart"/>
       <w:r>
         <w:rPr>
-          <w:rFonts w:ascii="Times New Roman" w:hAnsi="Times New Roman" w:cs="Times New Roman"/>
-          <w:sz w:val="24"/>
-          <w:szCs w:val="24"/>
+          <w:rFonts w:ascii="Arial" w:hAnsi="Arial" w:cs="Arial"/>
           <w:highlight w:val="cyan"/>
         </w:rPr>
         <w:t>children</w:t>
       </w:r>
       <w:r>
         <w:rPr>
-          <w:rFonts w:ascii="Times New Roman" w:hAnsi="Times New Roman" w:cs="Times New Roman"/>
-          <w:sz w:val="24"/>
-          <w:szCs w:val="24"/>
+          <w:rFonts w:ascii="Arial" w:hAnsi="Arial" w:cs="Arial"/>
           <w:highlight w:val="cyan"/>
         </w:rPr>
         <w:t>[</w:t>
@@ -85,18 +85,14 @@
       <w:proofErr w:type="gramEnd"/>
       <w:r>
         <w:rPr>
-          <w:rFonts w:ascii="Times New Roman" w:hAnsi="Times New Roman" w:cs="Times New Roman"/>
-          <w:sz w:val="24"/>
-          <w:szCs w:val="24"/>
+          <w:rFonts w:ascii="Arial" w:hAnsi="Arial" w:cs="Arial"/>
           <w:highlight w:val="cyan"/>
         </w:rPr>
         <w:t>5</w:t>
       </w:r>
       <w:r>
         <w:rPr>
-          <w:rFonts w:ascii="Times New Roman" w:hAnsi="Times New Roman" w:cs="Times New Roman"/>
-          <w:sz w:val="24"/>
-          <w:szCs w:val="24"/>
+          <w:rFonts w:ascii="Arial" w:hAnsi="Arial" w:cs="Arial"/>
           <w:highlight w:val="cyan"/>
         </w:rPr>
         <w:t>:</w:t>
@@ -104,27 +100,21 @@
       <w:proofErr w:type="gramStart"/>
       <w:r>
         <w:rPr>
-          <w:rFonts w:ascii="Times New Roman" w:hAnsi="Times New Roman" w:cs="Times New Roman"/>
-          <w:sz w:val="24"/>
-          <w:szCs w:val="24"/>
+          <w:rFonts w:ascii="Arial" w:hAnsi="Arial" w:cs="Arial"/>
           <w:highlight w:val="cyan"/>
         </w:rPr>
         <w:t>]</w:t>
       </w:r>
       <w:r>
         <w:rPr>
-          <w:rFonts w:ascii="Times New Roman" w:hAnsi="Times New Roman" w:cs="Times New Roman"/>
-          <w:sz w:val="24"/>
-          <w:szCs w:val="24"/>
+          <w:rFonts w:ascii="Arial" w:hAnsi="Arial" w:cs="Arial"/>
           <w:highlight w:val="cyan"/>
         </w:rPr>
         <w:t xml:space="preserve"> </w:t>
       </w:r>
       <w:r>
         <w:rPr>
-          <w:rFonts w:ascii="Times New Roman" w:hAnsi="Times New Roman" w:cs="Times New Roman"/>
-          <w:sz w:val="24"/>
-          <w:szCs w:val="24"/>
+          <w:rFonts w:ascii="Arial" w:hAnsi="Arial" w:cs="Arial"/>
         </w:rPr>
         <w:t>%}</w:t>
       </w:r>
@@ -136,85 +126,143 @@
           <w:tab w:val="left" w:leader="dot" w:pos="7920"/>
         </w:tabs>
         <w:rPr>
-          <w:rFonts w:ascii="Times New Roman" w:hAnsi="Times New Roman" w:cs="Times New Roman"/>
-          <w:sz w:val="24"/>
-          <w:szCs w:val="24"/>
+          <w:rFonts w:ascii="Arial" w:hAnsi="Arial" w:cs="Arial"/>
         </w:rPr>
       </w:pPr>
-      <w:r>
-        <w:rPr>
-          <w:rFonts w:ascii="Times New Roman" w:hAnsi="Times New Roman" w:cs="Times New Roman"/>
-          <w:sz w:val="24"/>
-          <w:szCs w:val="24"/>
+      <w:proofErr w:type="gramStart"/>
+      <w:r>
+        <w:rPr>
+          <w:rFonts w:ascii="Arial" w:hAnsi="Arial" w:cs="Arial"/>
+        </w:rPr>
+        <w:t xml:space="preserve">{{ </w:t>
+      </w:r>
+      <w:proofErr w:type="spellStart"/>
+      <w:r>
+        <w:rPr>
+          <w:rFonts w:ascii="Arial" w:hAnsi="Arial" w:cs="Arial"/>
+        </w:rPr>
+        <w:t>loop</w:t>
+      </w:r>
+      <w:proofErr w:type="gramEnd"/>
+      <w:r>
+        <w:rPr>
+          <w:rFonts w:ascii="Arial" w:hAnsi="Arial" w:cs="Arial"/>
+        </w:rPr>
+        <w:t>.index</w:t>
+      </w:r>
+      <w:proofErr w:type="spellEnd"/>
+      <w:r>
+        <w:rPr>
+          <w:rFonts w:ascii="Arial" w:hAnsi="Arial" w:cs="Arial"/>
+        </w:rPr>
+        <w:t xml:space="preserve"> + </w:t>
+      </w:r>
+      <w:proofErr w:type="gramStart"/>
+      <w:r>
+        <w:rPr>
+          <w:rFonts w:ascii="Arial" w:hAnsi="Arial" w:cs="Arial"/>
+        </w:rPr>
+        <w:t>5</w:t>
+      </w:r>
+      <w:r>
+        <w:rPr>
+          <w:rFonts w:ascii="Arial" w:hAnsi="Arial" w:cs="Arial"/>
+        </w:rPr>
+        <w:t xml:space="preserve"> }</w:t>
+      </w:r>
+      <w:proofErr w:type="gramEnd"/>
+      <w:r>
+        <w:rPr>
+          <w:rFonts w:ascii="Arial" w:hAnsi="Arial" w:cs="Arial"/>
+        </w:rPr>
+        <w:t xml:space="preserve">}. </w:t>
+      </w:r>
+      <w:proofErr w:type="gramStart"/>
+      <w:r>
+        <w:rPr>
+          <w:rFonts w:ascii="Arial" w:hAnsi="Arial" w:cs="Arial"/>
         </w:rPr>
         <w:t>{{</w:t>
       </w:r>
       <w:r>
         <w:rPr>
-          <w:rFonts w:ascii="Times New Roman" w:hAnsi="Times New Roman" w:cs="Times New Roman"/>
-          <w:sz w:val="24"/>
-          <w:szCs w:val="24"/>
+          <w:rFonts w:ascii="Arial" w:hAnsi="Arial" w:cs="Arial"/>
           <w:highlight w:val="yellow"/>
         </w:rPr>
         <w:t xml:space="preserve"> </w:t>
       </w:r>
       <w:r>
         <w:rPr>
-          <w:rFonts w:ascii="Times New Roman" w:hAnsi="Times New Roman" w:cs="Times New Roman"/>
-          <w:sz w:val="24"/>
-          <w:szCs w:val="24"/>
+          <w:rFonts w:ascii="Arial" w:hAnsi="Arial" w:cs="Arial"/>
           <w:highlight w:val="yellow"/>
         </w:rPr>
         <w:t>child</w:t>
       </w:r>
-      <w:r>
-        <w:rPr>
-          <w:rFonts w:ascii="Times New Roman" w:hAnsi="Times New Roman" w:cs="Times New Roman"/>
-          <w:sz w:val="24"/>
-          <w:szCs w:val="24"/>
+      <w:proofErr w:type="gramEnd"/>
+      <w:r>
+        <w:rPr>
+          <w:rFonts w:ascii="Arial" w:hAnsi="Arial" w:cs="Arial"/>
           <w:highlight w:val="yellow"/>
         </w:rPr>
         <w:t xml:space="preserve"> </w:t>
       </w:r>
       <w:r>
         <w:rPr>
-          <w:rFonts w:ascii="Times New Roman" w:hAnsi="Times New Roman" w:cs="Times New Roman"/>
-          <w:sz w:val="24"/>
-          <w:szCs w:val="24"/>
+          <w:rFonts w:ascii="Arial" w:hAnsi="Arial" w:cs="Arial"/>
         </w:rPr>
         <w:t>}}</w:t>
       </w:r>
       <w:r>
         <w:rPr>
-          <w:rFonts w:ascii="Times New Roman" w:hAnsi="Times New Roman" w:cs="Times New Roman"/>
-          <w:sz w:val="24"/>
-          <w:szCs w:val="24"/>
-        </w:rPr>
-        <w:t xml:space="preserve"> -</w:t>
-      </w:r>
-      <w:r>
-        <w:rPr>
-          <w:rFonts w:ascii="Times New Roman" w:hAnsi="Times New Roman" w:cs="Times New Roman"/>
-          <w:sz w:val="24"/>
-          <w:szCs w:val="24"/>
+          <w:rFonts w:ascii="Arial" w:hAnsi="Arial" w:cs="Arial"/>
+        </w:rPr>
+        <w:t xml:space="preserve"> </w:t>
+      </w:r>
+      <w:proofErr w:type="gramStart"/>
+      <w:r>
+        <w:rPr>
+          <w:rFonts w:ascii="Arial" w:hAnsi="Arial" w:cs="Arial"/>
+        </w:rPr>
+        <w:t>-</w:t>
+      </w:r>
+      <w:r>
+        <w:rPr>
+          <w:rFonts w:ascii="Arial" w:hAnsi="Arial" w:cs="Arial"/>
         </w:rPr>
         <w:t xml:space="preserve">  </w:t>
       </w:r>
       <w:r>
         <w:rPr>
-          <w:rFonts w:ascii="Times New Roman" w:hAnsi="Times New Roman" w:cs="Times New Roman"/>
-          <w:sz w:val="24"/>
-          <w:szCs w:val="24"/>
-        </w:rPr>
-        <w:t>Annual o</w:t>
-      </w:r>
-      <w:r>
-        <w:rPr>
-          <w:rFonts w:ascii="Times New Roman" w:hAnsi="Times New Roman" w:cs="Times New Roman"/>
-          <w:sz w:val="24"/>
-          <w:szCs w:val="24"/>
-        </w:rPr>
-        <w:t>vernights with payer: ________</w:t>
+          <w:rFonts w:ascii="Arial" w:hAnsi="Arial" w:cs="Arial"/>
+        </w:rPr>
+        <w:t>Annual</w:t>
+      </w:r>
+      <w:proofErr w:type="gramEnd"/>
+      <w:r>
+        <w:rPr>
+          <w:rFonts w:ascii="Arial" w:hAnsi="Arial" w:cs="Arial"/>
+        </w:rPr>
+        <w:t xml:space="preserve"> o</w:t>
+      </w:r>
+      <w:r>
+        <w:rPr>
+          <w:rFonts w:ascii="Arial" w:hAnsi="Arial" w:cs="Arial"/>
+        </w:rPr>
+        <w:t xml:space="preserve">vernights with </w:t>
+      </w:r>
+      <w:proofErr w:type="gramStart"/>
+      <w:r>
+        <w:rPr>
+          <w:rFonts w:ascii="Arial" w:hAnsi="Arial" w:cs="Arial"/>
+        </w:rPr>
+        <w:t>payer: _</w:t>
+      </w:r>
+      <w:proofErr w:type="gramEnd"/>
+      <w:r>
+        <w:rPr>
+          <w:rFonts w:ascii="Arial" w:hAnsi="Arial" w:cs="Arial"/>
+        </w:rPr>
+        <w:t>_______</w:t>
       </w:r>
     </w:p>
     <w:p>
@@ -224,34 +272,27 @@
           <w:tab w:val="left" w:leader="dot" w:pos="5760"/>
         </w:tabs>
         <w:rPr>
-          <w:rFonts w:ascii="Times New Roman" w:hAnsi="Times New Roman" w:cs="Times New Roman"/>
-          <w:sz w:val="24"/>
-          <w:szCs w:val="24"/>
+          <w:rFonts w:ascii="Arial" w:hAnsi="Arial" w:cs="Arial"/>
         </w:rPr>
       </w:pPr>
       <w:r>
         <w:rPr>
-          <w:rFonts w:ascii="Times New Roman" w:hAnsi="Times New Roman" w:cs="Times New Roman"/>
-          <w:sz w:val="24"/>
-          <w:szCs w:val="24"/>
+          <w:rFonts w:ascii="Arial" w:hAnsi="Arial" w:cs="Arial"/>
         </w:rPr>
         <w:t>{%</w:t>
       </w:r>
       <w:r>
         <w:rPr>
-          <w:rFonts w:ascii="Times New Roman" w:hAnsi="Times New Roman" w:cs="Times New Roman"/>
-          <w:sz w:val="24"/>
-          <w:szCs w:val="24"/>
+          <w:rFonts w:ascii="Arial" w:hAnsi="Arial" w:cs="Arial"/>
           <w:highlight w:val="cyan"/>
         </w:rPr>
         <w:t xml:space="preserve">p </w:t>
       </w:r>
       <w:proofErr w:type="spellStart"/>
-      <w:r>
-        <w:rPr>
-          <w:rFonts w:ascii="Times New Roman" w:hAnsi="Times New Roman" w:cs="Times New Roman"/>
-          <w:sz w:val="24"/>
-          <w:szCs w:val="24"/>
+      <w:proofErr w:type="gramStart"/>
+      <w:r>
+        <w:rPr>
+          <w:rFonts w:ascii="Arial" w:hAnsi="Arial" w:cs="Arial"/>
           <w:highlight w:val="cyan"/>
         </w:rPr>
         <w:t>endfor</w:t>
@@ -259,28 +300,24 @@
       <w:proofErr w:type="spellEnd"/>
       <w:r>
         <w:rPr>
-          <w:rFonts w:ascii="Times New Roman" w:hAnsi="Times New Roman" w:cs="Times New Roman"/>
-          <w:sz w:val="24"/>
-          <w:szCs w:val="24"/>
+          <w:rFonts w:ascii="Arial" w:hAnsi="Arial" w:cs="Arial"/>
           <w:highlight w:val="cyan"/>
         </w:rPr>
         <w:t xml:space="preserve"> </w:t>
       </w:r>
       <w:r>
         <w:rPr>
-          <w:rFonts w:ascii="Times New Roman" w:hAnsi="Times New Roman" w:cs="Times New Roman"/>
-          <w:sz w:val="24"/>
-          <w:szCs w:val="24"/>
+          <w:rFonts w:ascii="Arial" w:hAnsi="Arial" w:cs="Arial"/>
         </w:rPr>
         <w:t>%}</w:t>
       </w:r>
+      <w:proofErr w:type="gramEnd"/>
     </w:p>
     <w:p>
       <w:pPr>
-        <w:spacing w:line="360" w:lineRule="auto"/>
-        <w:rPr>
-          <w:sz w:val="24"/>
-          <w:szCs w:val="24"/>
+        <w:jc w:val="center"/>
+        <w:rPr>
+          <w:rFonts w:ascii="Arial" w:hAnsi="Arial" w:cs="Arial"/>
         </w:rPr>
       </w:pPr>
     </w:p>
@@ -289,7 +326,7 @@
       <w:footerReference w:type="default" r:id="rId8"/>
       <w:pgSz w:w="12240" w:h="15840"/>
       <w:pgMar w:top="1497" w:right="1080" w:bottom="1440" w:left="1080" w:header="1440" w:footer="1008" w:gutter="0"/>
-      <w:pgNumType w:start="2"/>
+      <w:pgNumType w:start="1"/>
       <w:cols w:space="720"/>
       <w:formProt w:val="0"/>
       <w:docGrid w:linePitch="360" w:charSpace="4096"/>
@@ -331,71 +368,57 @@
       <w:spacing w:after="0"/>
       <w:jc w:val="center"/>
       <w:rPr>
-        <w:rFonts w:ascii="Helvetica" w:hAnsi="Helvetica" w:cs="Times New Roman"/>
+        <w:rFonts w:ascii="Arial" w:hAnsi="Arial" w:cs="Arial"/>
         <w:sz w:val="20"/>
         <w:szCs w:val="20"/>
       </w:rPr>
     </w:pPr>
     <w:r>
       <w:rPr>
-        <w:rFonts w:ascii="Helvetica" w:hAnsi="Helvetica" w:cs="Times New Roman"/>
-        <w:sz w:val="20"/>
-        <w:szCs w:val="20"/>
-      </w:rPr>
-      <w:t xml:space="preserve">ADDENDUM TO </w:t>
-    </w:r>
-  </w:p>
-  <w:p>
-    <w:pPr>
-      <w:spacing w:after="0"/>
-      <w:jc w:val="center"/>
-      <w:rPr>
-        <w:rFonts w:ascii="Helvetica" w:hAnsi="Helvetica" w:cs="Times New Roman"/>
-        <w:sz w:val="20"/>
-        <w:szCs w:val="20"/>
-      </w:rPr>
-    </w:pPr>
-    <w:r>
-      <w:rPr>
-        <w:rFonts w:ascii="Helvetica" w:hAnsi="Helvetica" w:cs="Times New Roman"/>
-        <w:sz w:val="20"/>
-        <w:szCs w:val="20"/>
-      </w:rPr>
-      <w:t>UNIFORM CHILD SUPPORT ORDER</w:t>
-    </w:r>
-  </w:p>
-  <w:p>
-    <w:pPr>
-      <w:suppressAutoHyphens w:val="0"/>
-      <w:spacing w:after="0"/>
-      <w:jc w:val="center"/>
-    </w:pPr>
-    <w:r>
-      <w:rPr>
-        <w:rFonts w:ascii="Helvetica" w:hAnsi="Helvetica" w:cs="Times New Roman"/>
+        <w:rFonts w:ascii="Arial" w:hAnsi="Arial" w:cs="Arial"/>
         <w:sz w:val="20"/>
         <w:szCs w:val="20"/>
       </w:rPr>
       <w:t xml:space="preserve">Page </w:t>
     </w:r>
     <w:r>
+      <w:rPr>
+        <w:rFonts w:ascii="Arial" w:hAnsi="Arial" w:cs="Arial"/>
+        <w:sz w:val="20"/>
+        <w:szCs w:val="20"/>
+      </w:rPr>
       <w:fldChar w:fldCharType="begin"/>
     </w:r>
     <w:r>
-      <w:instrText xml:space="preserve"> PAGE   \* MERGEFORMAT </w:instrText>
+      <w:rPr>
+        <w:rFonts w:ascii="Arial" w:hAnsi="Arial" w:cs="Arial"/>
+        <w:sz w:val="20"/>
+        <w:szCs w:val="20"/>
+      </w:rPr>
+      <w:instrText xml:space="preserve"> PAGE  \* Arabic  \* MERGEFORMAT </w:instrText>
     </w:r>
     <w:r>
+      <w:rPr>
+        <w:rFonts w:ascii="Arial" w:hAnsi="Arial" w:cs="Arial"/>
+        <w:sz w:val="20"/>
+        <w:szCs w:val="20"/>
+      </w:rPr>
       <w:fldChar w:fldCharType="separate"/>
     </w:r>
     <w:r>
       <w:rPr>
+        <w:rFonts w:ascii="Arial" w:hAnsi="Arial" w:cs="Arial"/>
         <w:noProof/>
+        <w:sz w:val="20"/>
+        <w:szCs w:val="20"/>
       </w:rPr>
-      <w:t>1</w:t>
+      <w:t>2</w:t>
     </w:r>
     <w:r>
       <w:rPr>
-        <w:noProof/>
+        <w:rFonts w:ascii="Arial" w:hAnsi="Arial" w:cs="Arial"/>
+        <w:sz w:val="20"/>
+        <w:szCs w:val="20"/>
       </w:rPr>
       <w:fldChar w:fldCharType="end"/>
     </w:r>
@@ -453,7 +476,7 @@
           <w:tcBorders>
             <w:top w:val="single" w:sz="12" w:space="0" w:color="auto"/>
             <w:left w:val="nil"/>
-            <w:bottom w:val="single" w:sz="12" w:space="0" w:color="auto"/>
+            <w:bottom w:val="single" w:sz="4" w:space="0" w:color="auto"/>
           </w:tcBorders>
           <w:vAlign w:val="center"/>
         </w:tcPr>
@@ -462,14 +485,16 @@
             <w:spacing w:before="120" w:after="0"/>
             <w:jc w:val="right"/>
             <w:rPr>
-              <w:rFonts w:ascii="Helvetica" w:hAnsi="Helvetica" w:cs="Times New Roman"/>
+              <w:b/>
+              <w:bCs/>
               <w:sz w:val="20"/>
               <w:szCs w:val="20"/>
             </w:rPr>
           </w:pPr>
           <w:r>
             <w:rPr>
-              <w:rFonts w:ascii="Helvetica" w:hAnsi="Helvetica" w:cs="Times New Roman"/>
+              <w:b/>
+              <w:bCs/>
               <w:sz w:val="20"/>
               <w:szCs w:val="20"/>
             </w:rPr>
@@ -481,7 +506,8 @@
             <w:spacing w:after="0"/>
             <w:jc w:val="right"/>
             <w:rPr>
-              <w:rFonts w:ascii="Helvetica" w:hAnsi="Helvetica" w:cs="Times New Roman"/>
+              <w:b/>
+              <w:bCs/>
               <w:sz w:val="20"/>
               <w:szCs w:val="20"/>
             </w:rPr>
@@ -489,26 +515,69 @@
           <w:proofErr w:type="gramStart"/>
           <w:r>
             <w:rPr>
-              <w:rFonts w:ascii="Helvetica" w:hAnsi="Helvetica" w:cs="Times New Roman"/>
+              <w:b/>
+              <w:bCs/>
               <w:caps/>
               <w:sz w:val="20"/>
               <w:szCs w:val="20"/>
             </w:rPr>
-            <w:t>{{ the</w:t>
+            <w:t xml:space="preserve">{{ </w:t>
+          </w:r>
+          <w:proofErr w:type="spellStart"/>
+          <w:r>
+            <w:rPr>
+              <w:b/>
+              <w:bCs/>
+              <w:sz w:val="20"/>
+              <w:szCs w:val="20"/>
+            </w:rPr>
+            <w:t>t</w:t>
+          </w:r>
+          <w:r>
+            <w:rPr>
+              <w:b/>
+              <w:bCs/>
+              <w:sz w:val="20"/>
+              <w:szCs w:val="20"/>
+            </w:rPr>
+            <w:t>he</w:t>
           </w:r>
           <w:proofErr w:type="gramEnd"/>
           <w:r>
             <w:rPr>
-              <w:rFonts w:ascii="Helvetica" w:hAnsi="Helvetica" w:cs="Times New Roman"/>
+              <w:b/>
+              <w:bCs/>
+              <w:sz w:val="20"/>
+              <w:szCs w:val="20"/>
+            </w:rPr>
+            <w:t>_</w:t>
+          </w:r>
+          <w:proofErr w:type="gramStart"/>
+          <w:r>
+            <w:rPr>
+              <w:b/>
+              <w:bCs/>
+              <w:sz w:val="20"/>
+              <w:szCs w:val="20"/>
+            </w:rPr>
+            <w:t>court.number</w:t>
+          </w:r>
+          <w:proofErr w:type="spellEnd"/>
+          <w:proofErr w:type="gramEnd"/>
+          <w:r>
+            <w:rPr>
+              <w:b/>
+              <w:bCs/>
               <w:caps/>
               <w:sz w:val="20"/>
               <w:szCs w:val="20"/>
             </w:rPr>
-            <w:t>_court_number }}</w:t>
-          </w:r>
-          <w:r>
-            <w:rPr>
-              <w:rFonts w:ascii="Helvetica" w:hAnsi="Helvetica" w:cs="Times New Roman"/>
+            <w:t xml:space="preserve"> }}</w:t>
+          </w:r>
+          <w:r>
+            <w:rPr>
+              <w:b/>
+              <w:bCs/>
               <w:sz w:val="20"/>
               <w:szCs w:val="20"/>
             </w:rPr>
@@ -520,7 +589,8 @@
             <w:spacing w:after="120"/>
             <w:jc w:val="right"/>
             <w:rPr>
-              <w:rFonts w:ascii="Times New Roman" w:hAnsi="Times New Roman" w:cs="Times New Roman"/>
+              <w:b/>
+              <w:bCs/>
               <w:sz w:val="20"/>
               <w:szCs w:val="20"/>
             </w:rPr>
@@ -528,26 +598,100 @@
           <w:proofErr w:type="gramStart"/>
           <w:r>
             <w:rPr>
-              <w:rFonts w:ascii="Helvetica" w:hAnsi="Helvetica" w:cs="Times New Roman"/>
+              <w:b/>
+              <w:bCs/>
               <w:caps/>
               <w:sz w:val="20"/>
               <w:szCs w:val="20"/>
             </w:rPr>
-            <w:t>{{ county</w:t>
+            <w:t xml:space="preserve">{{ </w:t>
+          </w:r>
+          <w:proofErr w:type="spellStart"/>
+          <w:r>
+            <w:rPr>
+              <w:b/>
+              <w:bCs/>
+              <w:sz w:val="20"/>
+              <w:szCs w:val="20"/>
+            </w:rPr>
+            <w:t>county</w:t>
           </w:r>
           <w:proofErr w:type="gramEnd"/>
           <w:r>
             <w:rPr>
-              <w:rFonts w:ascii="Helvetica" w:hAnsi="Helvetica" w:cs="Times New Roman"/>
+              <w:b/>
+              <w:bCs/>
+              <w:sz w:val="20"/>
+              <w:szCs w:val="20"/>
+            </w:rPr>
+            <w:t>_</w:t>
+          </w:r>
+          <w:proofErr w:type="gramStart"/>
+          <w:r>
+            <w:rPr>
+              <w:b/>
+              <w:bCs/>
+              <w:sz w:val="20"/>
+              <w:szCs w:val="20"/>
+            </w:rPr>
+            <w:t>choice.upper</w:t>
+          </w:r>
+          <w:proofErr w:type="spellEnd"/>
+          <w:proofErr w:type="gramEnd"/>
+          <w:r>
+            <w:rPr>
+              <w:b/>
+              <w:bCs/>
+              <w:sz w:val="20"/>
+              <w:szCs w:val="20"/>
+            </w:rPr>
+            <w:t>(</w:t>
+          </w:r>
+          <w:proofErr w:type="gramStart"/>
+          <w:r>
+            <w:rPr>
+              <w:b/>
+              <w:bCs/>
+              <w:sz w:val="20"/>
+              <w:szCs w:val="20"/>
+            </w:rPr>
+            <w:t>)</w:t>
+          </w:r>
+          <w:r>
+            <w:rPr>
+              <w:b/>
+              <w:bCs/>
               <w:caps/>
               <w:sz w:val="20"/>
               <w:szCs w:val="20"/>
             </w:rPr>
-            <w:t xml:space="preserve">_choice }} </w:t>
-          </w:r>
-          <w:r>
-            <w:rPr>
-              <w:rFonts w:ascii="Helvetica" w:hAnsi="Helvetica" w:cs="Times New Roman"/>
+            <w:t xml:space="preserve"> }</w:t>
+          </w:r>
+          <w:proofErr w:type="gramEnd"/>
+          <w:r>
+            <w:rPr>
+              <w:b/>
+              <w:bCs/>
+              <w:caps/>
+              <w:sz w:val="20"/>
+              <w:szCs w:val="20"/>
+            </w:rPr>
+            <w:t>}</w:t>
+          </w:r>
+          <w:r>
+            <w:rPr>
+              <w:b/>
+              <w:bCs/>
+              <w:caps/>
+              <w:sz w:val="20"/>
+              <w:szCs w:val="20"/>
+            </w:rPr>
+            <w:t xml:space="preserve"> </w:t>
+          </w:r>
+          <w:r>
+            <w:rPr>
+              <w:b/>
+              <w:bCs/>
               <w:sz w:val="20"/>
               <w:szCs w:val="20"/>
             </w:rPr>
@@ -560,7 +704,7 @@
           <w:tcW w:w="4230" w:type="dxa"/>
           <w:tcBorders>
             <w:top w:val="single" w:sz="12" w:space="0" w:color="auto"/>
-            <w:bottom w:val="single" w:sz="12" w:space="0" w:color="auto"/>
+            <w:bottom w:val="single" w:sz="4" w:space="0" w:color="auto"/>
           </w:tcBorders>
           <w:vAlign w:val="center"/>
         </w:tcPr>
@@ -569,14 +713,16 @@
             <w:spacing w:after="0"/>
             <w:jc w:val="center"/>
             <w:rPr>
-              <w:rFonts w:ascii="Helvetica" w:hAnsi="Helvetica" w:cs="Times New Roman"/>
+              <w:b/>
+              <w:bCs/>
               <w:sz w:val="20"/>
               <w:szCs w:val="20"/>
             </w:rPr>
           </w:pPr>
           <w:r>
             <w:rPr>
-              <w:rFonts w:ascii="Helvetica" w:hAnsi="Helvetica" w:cs="Times New Roman"/>
+              <w:b/>
+              <w:bCs/>
               <w:sz w:val="20"/>
               <w:szCs w:val="20"/>
             </w:rPr>
@@ -588,14 +734,16 @@
             <w:spacing w:after="0"/>
             <w:jc w:val="center"/>
             <w:rPr>
-              <w:rFonts w:ascii="Helvetica" w:hAnsi="Helvetica" w:cs="Times New Roman"/>
+              <w:b/>
+              <w:bCs/>
               <w:sz w:val="20"/>
               <w:szCs w:val="20"/>
             </w:rPr>
           </w:pPr>
           <w:r>
             <w:rPr>
-              <w:rFonts w:ascii="Helvetica" w:hAnsi="Helvetica" w:cs="Times New Roman"/>
+              <w:b/>
+              <w:bCs/>
               <w:sz w:val="20"/>
               <w:szCs w:val="20"/>
             </w:rPr>
@@ -607,40 +755,47 @@
             <w:spacing w:after="0"/>
             <w:jc w:val="center"/>
             <w:rPr>
-              <w:rFonts w:ascii="Helvetica" w:hAnsi="Helvetica" w:cs="Times New Roman"/>
-              <w:sz w:val="18"/>
-              <w:szCs w:val="18"/>
+              <w:b/>
+              <w:bCs/>
+              <w:sz w:val="20"/>
+              <w:szCs w:val="20"/>
             </w:rPr>
           </w:pPr>
           <w:r>
             <w:rPr>
               <w:rFonts w:ascii="Segoe UI Symbol" w:hAnsi="Segoe UI Symbol" w:cs="Segoe UI Symbol"/>
-              <w:sz w:val="18"/>
-              <w:szCs w:val="18"/>
+              <w:b/>
+              <w:bCs/>
+              <w:sz w:val="20"/>
+              <w:szCs w:val="20"/>
             </w:rPr>
             <w:t>☐</w:t>
           </w:r>
           <w:r>
             <w:rPr>
-              <w:rFonts w:ascii="Helvetica" w:hAnsi="Helvetica" w:cs="Times New Roman"/>
-              <w:sz w:val="18"/>
-              <w:szCs w:val="18"/>
+              <w:b/>
+              <w:bCs/>
+              <w:sz w:val="20"/>
+              <w:szCs w:val="20"/>
             </w:rPr>
             <w:t xml:space="preserve"> EX PARTE             </w:t>
           </w:r>
           <w:r>
             <w:rPr>
               <w:rFonts w:ascii="Segoe UI Symbol" w:hAnsi="Segoe UI Symbol" w:cs="Segoe UI Symbol"/>
-              <w:sz w:val="18"/>
-              <w:szCs w:val="18"/>
+              <w:b/>
+              <w:bCs/>
+              <w:sz w:val="20"/>
+              <w:szCs w:val="20"/>
             </w:rPr>
             <w:t>☐</w:t>
           </w:r>
           <w:r>
             <w:rPr>
-              <w:rFonts w:ascii="Helvetica" w:hAnsi="Helvetica" w:cs="Times New Roman"/>
-              <w:sz w:val="18"/>
-              <w:szCs w:val="18"/>
+              <w:b/>
+              <w:bCs/>
+              <w:sz w:val="20"/>
+              <w:szCs w:val="20"/>
             </w:rPr>
             <w:t xml:space="preserve"> TEMPORARY</w:t>
           </w:r>
@@ -650,7 +805,8 @@
             <w:spacing w:after="0"/>
             <w:jc w:val="center"/>
             <w:rPr>
-              <w:rFonts w:ascii="Helvetica" w:hAnsi="Helvetica" w:cs="Times New Roman"/>
+              <w:b/>
+              <w:bCs/>
               <w:sz w:val="20"/>
               <w:szCs w:val="20"/>
             </w:rPr>
@@ -658,32 +814,38 @@
           <w:r>
             <w:rPr>
               <w:rFonts w:ascii="Segoe UI Symbol" w:hAnsi="Segoe UI Symbol" w:cs="Segoe UI Symbol"/>
-              <w:sz w:val="18"/>
-              <w:szCs w:val="18"/>
+              <w:b/>
+              <w:bCs/>
+              <w:sz w:val="20"/>
+              <w:szCs w:val="20"/>
             </w:rPr>
             <w:t>☐</w:t>
           </w:r>
           <w:r>
             <w:rPr>
-              <w:rFonts w:ascii="Helvetica" w:hAnsi="Helvetica" w:cs="Times New Roman"/>
-              <w:sz w:val="18"/>
-              <w:szCs w:val="18"/>
+              <w:b/>
+              <w:bCs/>
+              <w:sz w:val="20"/>
+              <w:szCs w:val="20"/>
             </w:rPr>
             <w:t xml:space="preserve"> MODIFICATION                 </w:t>
           </w:r>
           <w:r>
             <w:rPr>
               <w:rFonts w:ascii="Segoe UI Symbol" w:hAnsi="Segoe UI Symbol" w:cs="Segoe UI Symbol"/>
-              <w:sz w:val="18"/>
-              <w:szCs w:val="18"/>
+              <w:b/>
+              <w:bCs/>
+              <w:sz w:val="20"/>
+              <w:szCs w:val="20"/>
             </w:rPr>
             <w:t>☐</w:t>
           </w:r>
           <w:r>
             <w:rPr>
-              <w:rFonts w:ascii="Helvetica" w:hAnsi="Helvetica" w:cs="Times New Roman"/>
-              <w:sz w:val="18"/>
-              <w:szCs w:val="18"/>
+              <w:b/>
+              <w:bCs/>
+              <w:sz w:val="20"/>
+              <w:szCs w:val="20"/>
             </w:rPr>
             <w:t xml:space="preserve"> FINAL</w:t>
           </w:r>
@@ -694,7 +856,7 @@
           <w:tcW w:w="3510" w:type="dxa"/>
           <w:tcBorders>
             <w:top w:val="single" w:sz="12" w:space="0" w:color="auto"/>
-            <w:bottom w:val="single" w:sz="12" w:space="0" w:color="auto"/>
+            <w:bottom w:val="single" w:sz="4" w:space="0" w:color="auto"/>
             <w:right w:val="nil"/>
           </w:tcBorders>
           <w:vAlign w:val="center"/>
@@ -704,14 +866,16 @@
             <w:spacing w:after="0"/>
             <w:jc w:val="center"/>
             <w:rPr>
-              <w:rFonts w:ascii="Helvetica" w:hAnsi="Helvetica" w:cs="Times New Roman"/>
+              <w:b/>
+              <w:bCs/>
               <w:sz w:val="20"/>
               <w:szCs w:val="20"/>
             </w:rPr>
           </w:pPr>
           <w:r>
             <w:rPr>
-              <w:rFonts w:ascii="Helvetica" w:hAnsi="Helvetica" w:cs="Times New Roman"/>
+              <w:b/>
+              <w:bCs/>
               <w:sz w:val="20"/>
               <w:szCs w:val="20"/>
             </w:rPr>
@@ -722,6 +886,8 @@
           <w:pPr>
             <w:jc w:val="center"/>
             <w:rPr>
+              <w:b/>
+              <w:bCs/>
               <w:sz w:val="20"/>
               <w:szCs w:val="20"/>
             </w:rPr>
@@ -729,7 +895,8 @@
           <w:proofErr w:type="gramStart"/>
           <w:r>
             <w:rPr>
-              <w:rFonts w:ascii="Helvetica" w:hAnsi="Helvetica" w:cs="Times New Roman"/>
+              <w:b/>
+              <w:bCs/>
               <w:sz w:val="20"/>
               <w:szCs w:val="20"/>
             </w:rPr>
@@ -738,7 +905,8 @@
           <w:proofErr w:type="spellStart"/>
           <w:r>
             <w:rPr>
-              <w:rFonts w:ascii="Helvetica" w:hAnsi="Helvetica" w:cs="Times New Roman"/>
+              <w:b/>
+              <w:bCs/>
               <w:sz w:val="20"/>
               <w:szCs w:val="20"/>
             </w:rPr>
@@ -747,7 +915,8 @@
           <w:proofErr w:type="gramEnd"/>
           <w:r>
             <w:rPr>
-              <w:rFonts w:ascii="Helvetica" w:hAnsi="Helvetica" w:cs="Times New Roman"/>
+              <w:b/>
+              <w:bCs/>
               <w:sz w:val="20"/>
               <w:szCs w:val="20"/>
             </w:rPr>
@@ -756,7 +925,8 @@
           <w:proofErr w:type="spellEnd"/>
           <w:r>
             <w:rPr>
-              <w:rFonts w:ascii="Helvetica" w:hAnsi="Helvetica" w:cs="Times New Roman"/>
+              <w:b/>
+              <w:bCs/>
               <w:sz w:val="20"/>
               <w:szCs w:val="20"/>
             </w:rPr>
@@ -1356,6 +1526,19 @@
       </w:tblBorders>
     </w:tblPr>
   </w:style>
+  <w:style w:type="paragraph" w:styleId="Revision">
+    <w:name w:val="Revision"/>
+    <w:hidden/>
+    <w:uiPriority w:val="99"/>
+    <w:semiHidden/>
+    <w:rsid w:val="00D41E30"/>
+    <w:pPr>
+      <w:suppressAutoHyphens w:val="0"/>
+    </w:pPr>
+    <w:rPr>
+      <w:sz w:val="22"/>
+    </w:rPr>
+  </w:style>
 </w:styles>
 </file>
 

</xml_diff>